<commit_message>
Hackathon kit documents: Stellar palette (yellow, black, white)
</commit_message>
<xml_diff>
--- a/hackathon-kit/01-project-evidence-canvas.docx
+++ b/hackathon-kit/01-project-evidence-canvas.docx
@@ -11,7 +11,7 @@
           <w:rFonts w:ascii="Arial" w:cs="Arial" w:eastAsia="Arial" w:hAnsi="Arial"/>
           <w:b/>
           <w:bCs/>
-          <w:color w:val="D45C39"/>
+          <w:color w:val="0F0F0F"/>
           <w:sz w:val="15"/>
           <w:szCs w:val="15"/>
         </w:rPr>
@@ -36,7 +36,7 @@
     <w:p>
       <w:pPr>
         <w:pBdr>
-          <w:bottom w:val="single" w:color="D45C39" w:sz="12" w:space="6"/>
+          <w:bottom w:val="single" w:color="FDDA24" w:sz="24" w:space="6"/>
         </w:pBdr>
         <w:spacing w:after="160" w:before="0"/>
       </w:pPr>
@@ -81,7 +81,7 @@
               <w:bottom w:val="single" w:color="A8A8A8" w:sz="4"/>
               <w:right w:val="single" w:color="A8A8A8" w:sz="4"/>
             </w:tcBorders>
-            <w:shd w:fill="F4F1EE" w:color="auto" w:val="clear"/>
+            <w:shd w:fill="FDDA24" w:color="auto" w:val="clear"/>
             <w:tcMar>
               <w:top w:type="dxa" w:w="60"/>
               <w:left w:type="dxa" w:w="90"/>
@@ -115,7 +115,7 @@
               <w:bottom w:val="single" w:color="A8A8A8" w:sz="4"/>
               <w:right w:val="single" w:color="A8A8A8" w:sz="4"/>
             </w:tcBorders>
-            <w:shd w:fill="F4F1EE" w:color="auto" w:val="clear"/>
+            <w:shd w:fill="FDDA24" w:color="auto" w:val="clear"/>
             <w:tcMar>
               <w:top w:type="dxa" w:w="60"/>
               <w:left w:type="dxa" w:w="90"/>
@@ -149,7 +149,7 @@
               <w:bottom w:val="single" w:color="A8A8A8" w:sz="4"/>
               <w:right w:val="single" w:color="A8A8A8" w:sz="4"/>
             </w:tcBorders>
-            <w:shd w:fill="F4F1EE" w:color="auto" w:val="clear"/>
+            <w:shd w:fill="FDDA24" w:color="auto" w:val="clear"/>
             <w:tcMar>
               <w:top w:type="dxa" w:w="60"/>
               <w:left w:type="dxa" w:w="90"/>
@@ -513,7 +513,7 @@
               <w:bottom w:val="single" w:color="A8A8A8" w:sz="4"/>
               <w:right w:val="single" w:color="A8A8A8" w:sz="4"/>
             </w:tcBorders>
-            <w:shd w:fill="F4F1EE" w:color="auto" w:val="clear"/>
+            <w:shd w:fill="FDDA24" w:color="auto" w:val="clear"/>
             <w:tcMar>
               <w:top w:type="dxa" w:w="60"/>
               <w:left w:type="dxa" w:w="90"/>
@@ -547,7 +547,7 @@
               <w:bottom w:val="single" w:color="A8A8A8" w:sz="4"/>
               <w:right w:val="single" w:color="A8A8A8" w:sz="4"/>
             </w:tcBorders>
-            <w:shd w:fill="F4F1EE" w:color="auto" w:val="clear"/>
+            <w:shd w:fill="FDDA24" w:color="auto" w:val="clear"/>
             <w:tcMar>
               <w:top w:type="dxa" w:w="60"/>
               <w:left w:type="dxa" w:w="90"/>
@@ -581,7 +581,7 @@
               <w:bottom w:val="single" w:color="A8A8A8" w:sz="4"/>
               <w:right w:val="single" w:color="A8A8A8" w:sz="4"/>
             </w:tcBorders>
-            <w:shd w:fill="F4F1EE" w:color="auto" w:val="clear"/>
+            <w:shd w:fill="FDDA24" w:color="auto" w:val="clear"/>
             <w:tcMar>
               <w:top w:type="dxa" w:w="60"/>
               <w:left w:type="dxa" w:w="90"/>
@@ -1237,7 +1237,7 @@
               <w:bottom w:val="single" w:color="A8A8A8" w:sz="4"/>
               <w:right w:val="single" w:color="A8A8A8" w:sz="4"/>
             </w:tcBorders>
-            <w:shd w:fill="F4F1EE" w:color="auto" w:val="clear"/>
+            <w:shd w:fill="FDDA24" w:color="auto" w:val="clear"/>
             <w:tcMar>
               <w:top w:type="dxa" w:w="60"/>
               <w:left w:type="dxa" w:w="90"/>
@@ -1271,7 +1271,7 @@
               <w:bottom w:val="single" w:color="A8A8A8" w:sz="4"/>
               <w:right w:val="single" w:color="A8A8A8" w:sz="4"/>
             </w:tcBorders>
-            <w:shd w:fill="F4F1EE" w:color="auto" w:val="clear"/>
+            <w:shd w:fill="FDDA24" w:color="auto" w:val="clear"/>
             <w:tcMar>
               <w:top w:type="dxa" w:w="60"/>
               <w:left w:type="dxa" w:w="90"/>
@@ -1703,7 +1703,7 @@
               <w:bottom w:val="single" w:color="A8A8A8" w:sz="4"/>
               <w:right w:val="single" w:color="A8A8A8" w:sz="4"/>
             </w:tcBorders>
-            <w:shd w:fill="F4F1EE" w:color="auto" w:val="clear"/>
+            <w:shd w:fill="FDDA24" w:color="auto" w:val="clear"/>
             <w:tcMar>
               <w:top w:type="dxa" w:w="60"/>
               <w:left w:type="dxa" w:w="90"/>
@@ -1737,7 +1737,7 @@
               <w:bottom w:val="single" w:color="A8A8A8" w:sz="4"/>
               <w:right w:val="single" w:color="A8A8A8" w:sz="4"/>
             </w:tcBorders>
-            <w:shd w:fill="F4F1EE" w:color="auto" w:val="clear"/>
+            <w:shd w:fill="FDDA24" w:color="auto" w:val="clear"/>
             <w:tcMar>
               <w:top w:type="dxa" w:w="60"/>
               <w:left w:type="dxa" w:w="90"/>
@@ -1771,7 +1771,7 @@
               <w:bottom w:val="single" w:color="A8A8A8" w:sz="4"/>
               <w:right w:val="single" w:color="A8A8A8" w:sz="4"/>
             </w:tcBorders>
-            <w:shd w:fill="F4F1EE" w:color="auto" w:val="clear"/>
+            <w:shd w:fill="FDDA24" w:color="auto" w:val="clear"/>
             <w:tcMar>
               <w:top w:type="dxa" w:w="60"/>
               <w:left w:type="dxa" w:w="90"/>
@@ -1805,7 +1805,7 @@
               <w:bottom w:val="single" w:color="A8A8A8" w:sz="4"/>
               <w:right w:val="single" w:color="A8A8A8" w:sz="4"/>
             </w:tcBorders>
-            <w:shd w:fill="F4F1EE" w:color="auto" w:val="clear"/>
+            <w:shd w:fill="FDDA24" w:color="auto" w:val="clear"/>
             <w:tcMar>
               <w:top w:type="dxa" w:w="60"/>
               <w:left w:type="dxa" w:w="90"/>
@@ -2419,7 +2419,7 @@
               <w:bottom w:val="single" w:color="A8A8A8" w:sz="4"/>
               <w:right w:val="single" w:color="A8A8A8" w:sz="4"/>
             </w:tcBorders>
-            <w:shd w:fill="F4F1EE" w:color="auto" w:val="clear"/>
+            <w:shd w:fill="FDDA24" w:color="auto" w:val="clear"/>
             <w:tcMar>
               <w:top w:type="dxa" w:w="60"/>
               <w:left w:type="dxa" w:w="90"/>
@@ -2453,7 +2453,7 @@
               <w:bottom w:val="single" w:color="A8A8A8" w:sz="4"/>
               <w:right w:val="single" w:color="A8A8A8" w:sz="4"/>
             </w:tcBorders>
-            <w:shd w:fill="F4F1EE" w:color="auto" w:val="clear"/>
+            <w:shd w:fill="FDDA24" w:color="auto" w:val="clear"/>
             <w:tcMar>
               <w:top w:type="dxa" w:w="60"/>
               <w:left w:type="dxa" w:w="90"/>
@@ -2487,7 +2487,7 @@
               <w:bottom w:val="single" w:color="A8A8A8" w:sz="4"/>
               <w:right w:val="single" w:color="A8A8A8" w:sz="4"/>
             </w:tcBorders>
-            <w:shd w:fill="F4F1EE" w:color="auto" w:val="clear"/>
+            <w:shd w:fill="FDDA24" w:color="auto" w:val="clear"/>
             <w:tcMar>
               <w:top w:type="dxa" w:w="60"/>
               <w:left w:type="dxa" w:w="90"/>
@@ -2521,7 +2521,7 @@
               <w:bottom w:val="single" w:color="A8A8A8" w:sz="4"/>
               <w:right w:val="single" w:color="A8A8A8" w:sz="4"/>
             </w:tcBorders>
-            <w:shd w:fill="F4F1EE" w:color="auto" w:val="clear"/>
+            <w:shd w:fill="FDDA24" w:color="auto" w:val="clear"/>
             <w:tcMar>
               <w:top w:type="dxa" w:w="60"/>
               <w:left w:type="dxa" w:w="90"/>
@@ -2555,7 +2555,7 @@
               <w:bottom w:val="single" w:color="A8A8A8" w:sz="4"/>
               <w:right w:val="single" w:color="A8A8A8" w:sz="4"/>
             </w:tcBorders>
-            <w:shd w:fill="F4F1EE" w:color="auto" w:val="clear"/>
+            <w:shd w:fill="FDDA24" w:color="auto" w:val="clear"/>
             <w:tcMar>
               <w:top w:type="dxa" w:w="60"/>
               <w:left w:type="dxa" w:w="90"/>
@@ -2589,7 +2589,7 @@
               <w:bottom w:val="single" w:color="A8A8A8" w:sz="4"/>
               <w:right w:val="single" w:color="A8A8A8" w:sz="4"/>
             </w:tcBorders>
-            <w:shd w:fill="F4F1EE" w:color="auto" w:val="clear"/>
+            <w:shd w:fill="FDDA24" w:color="auto" w:val="clear"/>
             <w:tcMar>
               <w:top w:type="dxa" w:w="60"/>
               <w:left w:type="dxa" w:w="90"/>
@@ -4207,7 +4207,7 @@
               <w:bottom w:val="single" w:color="A8A8A8" w:sz="4"/>
               <w:right w:val="single" w:color="A8A8A8" w:sz="4"/>
             </w:tcBorders>
-            <w:shd w:fill="F4F1EE" w:color="auto" w:val="clear"/>
+            <w:shd w:fill="FDDA24" w:color="auto" w:val="clear"/>
             <w:tcMar>
               <w:top w:type="dxa" w:w="60"/>
               <w:left w:type="dxa" w:w="90"/>
@@ -4241,7 +4241,7 @@
               <w:bottom w:val="single" w:color="A8A8A8" w:sz="4"/>
               <w:right w:val="single" w:color="A8A8A8" w:sz="4"/>
             </w:tcBorders>
-            <w:shd w:fill="F4F1EE" w:color="auto" w:val="clear"/>
+            <w:shd w:fill="FDDA24" w:color="auto" w:val="clear"/>
             <w:tcMar>
               <w:top w:type="dxa" w:w="60"/>
               <w:left w:type="dxa" w:w="90"/>
@@ -4275,7 +4275,7 @@
               <w:bottom w:val="single" w:color="A8A8A8" w:sz="4"/>
               <w:right w:val="single" w:color="A8A8A8" w:sz="4"/>
             </w:tcBorders>
-            <w:shd w:fill="F4F1EE" w:color="auto" w:val="clear"/>
+            <w:shd w:fill="FDDA24" w:color="auto" w:val="clear"/>
             <w:tcMar>
               <w:top w:type="dxa" w:w="60"/>
               <w:left w:type="dxa" w:w="90"/>

</xml_diff>